<commit_message>
Program console, docs synced to the new mechanisms, master document rebuilt
- tools/console: the live Governor Program Console page (published on claude.ai as an
  artifact that reads agents, work items and an event log from its own store) with its
  documentation
- docs: H17 and H18 in the hypothesis table; the loop beacon is modelled (threat model,
  FMEA, message table); counts updated to 200 model tests and 20 RTL tests
- docs/safety-governor-design.docx rebuilt

Co-Authored-By: Claude Fable 5.1 <noreply@anthropic.com>
Claude-Session: https://claude.ai/code/session_01DkQpVYNjMdJtfzj74tR8ZC
</commit_message>
<xml_diff>
--- a/docs/safety-governor-design.docx
+++ b/docs/safety-governor-design.docx
@@ -3131,7 +3131,7 @@
               <w:jc w:val="left"/>
             </w:pPr>
             <w:r>
-              <w:t xml:space="preserve">One test file per hypothesis, H0 to H16 (159 tests). A hypothesis is a claim the blog makes; a test is what would knock it down. Forty-eight single-point mutations of the model and the RTL were run against the suite in the October 2026 audit; the ones that survived got tests</w:t>
+              <w:t xml:space="preserve">One test file per hypothesis, H0 to H18 (200 tests). A hypothesis is a claim the blog makes; a test is what would knock it down. Forty-eight single-point mutations of the model and the RTL were run against the suite in the October 2026 audit; the ones that survived got tests</w:t>
             </w:r>
           </w:p>
         </w:tc>
@@ -5394,6 +5394,456 @@
                 <w:rStyle w:val="VerbatimChar"/>
               </w:rPr>
               <w:t xml:space="preserve">rtl/governor_rtl/meter.py</w:t>
+            </w:r>
+          </w:p>
+        </w:tc>
+      </w:tr>
+      <w:tr>
+        <w:tc>
+          <w:tcPr/>
+          <w:p>
+            <w:pPr>
+              <w:pStyle w:val="Compact"/>
+              <w:jc w:val="left"/>
+            </w:pPr>
+            <w:r>
+              <w:t xml:space="preserve">Response release and the egress hold</w:t>
+            </w:r>
+          </w:p>
+        </w:tc>
+        <w:tc>
+          <w:tcPr/>
+          <w:p>
+            <w:pPr>
+              <w:pStyle w:val="Compact"/>
+              <w:jc w:val="left"/>
+            </w:pPr>
+            <w:r>
+              <w:t xml:space="preserve">The mail room keeps the parcel until the permit arrives; an inspector who was never asked means no permit</w:t>
+            </w:r>
+          </w:p>
+        </w:tc>
+        <w:tc>
+          <w:tcPr/>
+          <w:p>
+            <w:pPr>
+              <w:pStyle w:val="Compact"/>
+              <w:jc w:val="left"/>
+            </w:pPr>
+            <w:r>
+              <w:rPr>
+                <w:rStyle w:val="VerbatimChar"/>
+              </w:rPr>
+              <w:t xml:space="preserve">docs/04</w:t>
+            </w:r>
+            <w:r>
+              <w:t xml:space="preserve"> </w:t>
+            </w:r>
+            <w:r>
+              <w:t xml:space="preserve">§3,</w:t>
+            </w:r>
+            <w:r>
+              <w:t xml:space="preserve"> </w:t>
+            </w:r>
+            <w:r>
+              <w:rPr>
+                <w:rStyle w:val="VerbatimChar"/>
+              </w:rPr>
+              <w:t xml:space="preserve">docs/07</w:t>
+            </w:r>
+            <w:r>
+              <w:t xml:space="preserve"> </w:t>
+            </w:r>
+            <w:r>
+              <w:t xml:space="preserve">H17 and H18</w:t>
+            </w:r>
+          </w:p>
+        </w:tc>
+        <w:tc>
+          <w:tcPr/>
+          <w:p>
+            <w:pPr>
+              <w:pStyle w:val="Compact"/>
+              <w:jc w:val="left"/>
+            </w:pPr>
+            <w:r>
+              <w:rPr>
+                <w:rStyle w:val="VerbatimChar"/>
+              </w:rPr>
+              <w:t xml:space="preserve">govsim/governor.py</w:t>
+            </w:r>
+            <w:r>
+              <w:t xml:space="preserve"> </w:t>
+            </w:r>
+            <w:r>
+              <w:t xml:space="preserve">(</w:t>
+            </w:r>
+            <w:r>
+              <w:rPr>
+                <w:rStyle w:val="VerbatimChar"/>
+              </w:rPr>
+              <w:t xml:space="preserve">_release_gate</w:t>
+            </w:r>
+            <w:r>
+              <w:t xml:space="preserve">),</w:t>
+            </w:r>
+            <w:r>
+              <w:t xml:space="preserve"> </w:t>
+            </w:r>
+            <w:r>
+              <w:rPr>
+                <w:rStyle w:val="VerbatimChar"/>
+              </w:rPr>
+              <w:t xml:space="preserve">govsim/endpoints.py</w:t>
+            </w:r>
+            <w:r>
+              <w:t xml:space="preserve"> </w:t>
+            </w:r>
+            <w:r>
+              <w:t xml:space="preserve">(</w:t>
+            </w:r>
+            <w:r>
+              <w:rPr>
+                <w:rStyle w:val="VerbatimChar"/>
+              </w:rPr>
+              <w:t xml:space="preserve">EgressEndpoint</w:t>
+            </w:r>
+            <w:r>
+              <w:t xml:space="preserve">,</w:t>
+            </w:r>
+            <w:r>
+              <w:t xml:space="preserve"> </w:t>
+            </w:r>
+            <w:r>
+              <w:rPr>
+                <w:rStyle w:val="VerbatimChar"/>
+              </w:rPr>
+              <w:t xml:space="preserve">AuditStore</w:t>
+            </w:r>
+            <w:r>
+              <w:t xml:space="preserve">)</w:t>
+            </w:r>
+          </w:p>
+        </w:tc>
+        <w:tc>
+          <w:tcPr/>
+          <w:p>
+            <w:pPr>
+              <w:pStyle w:val="Compact"/>
+              <w:jc w:val="left"/>
+            </w:pPr>
+            <w:r>
+              <w:rPr>
+                <w:rStyle w:val="VerbatimChar"/>
+              </w:rPr>
+              <w:t xml:space="preserve">tests/test_h17_use_cases.py</w:t>
+            </w:r>
+            <w:r>
+              <w:t xml:space="preserve">,</w:t>
+            </w:r>
+            <w:r>
+              <w:t xml:space="preserve"> </w:t>
+            </w:r>
+            <w:r>
+              <w:rPr>
+                <w:rStyle w:val="VerbatimChar"/>
+              </w:rPr>
+              <w:t xml:space="preserve">test_h18_oversight.py</w:t>
+            </w:r>
+          </w:p>
+        </w:tc>
+        <w:tc>
+          <w:tcPr/>
+          <w:p>
+            <w:pPr>
+              <w:pStyle w:val="Compact"/>
+              <w:jc w:val="left"/>
+            </w:pPr>
+            <w:r>
+              <w:t xml:space="preserve">firmware and policy; no new RTL</w:t>
+            </w:r>
+          </w:p>
+        </w:tc>
+      </w:tr>
+      <w:tr>
+        <w:tc>
+          <w:tcPr/>
+          <w:p>
+            <w:pPr>
+              <w:pStyle w:val="Compact"/>
+              <w:jc w:val="left"/>
+            </w:pPr>
+            <w:r>
+              <w:t xml:space="preserve">Loop beacon</w:t>
+            </w:r>
+          </w:p>
+        </w:tc>
+        <w:tc>
+          <w:tcPr/>
+          <w:p>
+            <w:pPr>
+              <w:pStyle w:val="Compact"/>
+              <w:jc w:val="left"/>
+            </w:pPr>
+            <w:r>
+              <w:t xml:space="preserve">Roll call on the fire-alarm loop: a station that says its switch is open while the bell wire still carries current has been bypassed</w:t>
+            </w:r>
+          </w:p>
+        </w:tc>
+        <w:tc>
+          <w:tcPr/>
+          <w:p>
+            <w:pPr>
+              <w:pStyle w:val="Compact"/>
+              <w:jc w:val="left"/>
+            </w:pPr>
+            <w:r>
+              <w:rPr>
+                <w:rStyle w:val="VerbatimChar"/>
+              </w:rPr>
+              <w:t xml:space="preserve">docs/02</w:t>
+            </w:r>
+            <w:r>
+              <w:t xml:space="preserve"> </w:t>
+            </w:r>
+            <w:r>
+              <w:t xml:space="preserve">§1 and §3</w:t>
+            </w:r>
+          </w:p>
+        </w:tc>
+        <w:tc>
+          <w:tcPr/>
+          <w:p>
+            <w:pPr>
+              <w:pStyle w:val="Compact"/>
+              <w:jc w:val="left"/>
+            </w:pPr>
+            <w:r>
+              <w:rPr>
+                <w:rStyle w:val="VerbatimChar"/>
+              </w:rPr>
+              <w:t xml:space="preserve">govsim/governor.py</w:t>
+            </w:r>
+            <w:r>
+              <w:t xml:space="preserve"> </w:t>
+            </w:r>
+            <w:r>
+              <w:t xml:space="preserve">(</w:t>
+            </w:r>
+            <w:r>
+              <w:rPr>
+                <w:rStyle w:val="VerbatimChar"/>
+              </w:rPr>
+              <w:t xml:space="preserve">_on_loop_beacon</w:t>
+            </w:r>
+            <w:r>
+              <w:t xml:space="preserve">,</w:t>
+            </w:r>
+            <w:r>
+              <w:t xml:space="preserve"> </w:t>
+            </w:r>
+            <w:r>
+              <w:rPr>
+                <w:rStyle w:val="VerbatimChar"/>
+              </w:rPr>
+              <w:t xml:space="preserve">_close_loop_window</w:t>
+            </w:r>
+            <w:r>
+              <w:t xml:space="preserve">),</w:t>
+            </w:r>
+            <w:r>
+              <w:t xml:space="preserve"> </w:t>
+            </w:r>
+            <w:r>
+              <w:rPr>
+                <w:rStyle w:val="VerbatimChar"/>
+              </w:rPr>
+              <w:t xml:space="preserve">govsim/fabric.py</w:t>
+            </w:r>
+            <w:r>
+              <w:t xml:space="preserve"> </w:t>
+            </w:r>
+            <w:r>
+              <w:t xml:space="preserve">(</w:t>
+            </w:r>
+            <w:r>
+              <w:rPr>
+                <w:rStyle w:val="VerbatimChar"/>
+              </w:rPr>
+              <w:t xml:space="preserve">jumper</w:t>
+            </w:r>
+            <w:r>
+              <w:t xml:space="preserve">)</w:t>
+            </w:r>
+          </w:p>
+        </w:tc>
+        <w:tc>
+          <w:tcPr/>
+          <w:p>
+            <w:pPr>
+              <w:pStyle w:val="Compact"/>
+              <w:jc w:val="left"/>
+            </w:pPr>
+            <w:r>
+              <w:rPr>
+                <w:rStyle w:val="VerbatimChar"/>
+              </w:rPr>
+              <w:t xml:space="preserve">tests/test_h11_halt_loop.py</w:t>
+            </w:r>
+          </w:p>
+        </w:tc>
+        <w:tc>
+          <w:tcPr/>
+          <w:p>
+            <w:pPr>
+              <w:pStyle w:val="Compact"/>
+              <w:jc w:val="left"/>
+            </w:pPr>
+            <w:r>
+              <w:t xml:space="preserve">firmware over the fabric</w:t>
+            </w:r>
+          </w:p>
+        </w:tc>
+      </w:tr>
+      <w:tr>
+        <w:tc>
+          <w:tcPr/>
+          <w:p>
+            <w:pPr>
+              <w:pStyle w:val="Compact"/>
+              <w:jc w:val="left"/>
+            </w:pPr>
+            <w:r>
+              <w:t xml:space="preserve">Buffer classes (integrated tier)</w:t>
+            </w:r>
+          </w:p>
+        </w:tc>
+        <w:tc>
+          <w:tcPr/>
+          <w:p>
+            <w:pPr>
+              <w:pStyle w:val="Compact"/>
+              <w:jc w:val="left"/>
+            </w:pPr>
+            <w:r>
+              <w:t xml:space="preserve">Weights never leave the building; working papers may go to colleagues on the roll; finished letters only to the front desk</w:t>
+            </w:r>
+          </w:p>
+        </w:tc>
+        <w:tc>
+          <w:tcPr/>
+          <w:p>
+            <w:pPr>
+              <w:pStyle w:val="Compact"/>
+              <w:jc w:val="left"/>
+            </w:pPr>
+            <w:r>
+              <w:rPr>
+                <w:rStyle w:val="VerbatimChar"/>
+              </w:rPr>
+              <w:t xml:space="preserve">docs/00</w:t>
+            </w:r>
+            <w:r>
+              <w:t xml:space="preserve"> </w:t>
+            </w:r>
+            <w:r>
+              <w:t xml:space="preserve">N5,</w:t>
+            </w:r>
+            <w:r>
+              <w:t xml:space="preserve"> </w:t>
+            </w:r>
+            <w:r>
+              <w:rPr>
+                <w:rStyle w:val="VerbatimChar"/>
+              </w:rPr>
+              <w:t xml:space="preserve">docs/07</w:t>
+            </w:r>
+            <w:r>
+              <w:t xml:space="preserve"> </w:t>
+            </w:r>
+            <w:r>
+              <w:t xml:space="preserve">H2b</w:t>
+            </w:r>
+          </w:p>
+        </w:tc>
+        <w:tc>
+          <w:tcPr/>
+          <w:p>
+            <w:pPr>
+              <w:pStyle w:val="Compact"/>
+              <w:jc w:val="left"/>
+            </w:pPr>
+            <w:r>
+              <w:rPr>
+                <w:rStyle w:val="VerbatimChar"/>
+              </w:rPr>
+              <w:t xml:space="preserve">govsim/policy.py</w:t>
+            </w:r>
+            <w:r>
+              <w:t xml:space="preserve"> </w:t>
+            </w:r>
+            <w:r>
+              <w:t xml:space="preserve">(</w:t>
+            </w:r>
+            <w:r>
+              <w:rPr>
+                <w:rStyle w:val="VerbatimChar"/>
+              </w:rPr>
+              <w:t xml:space="preserve">buffer_allowed</w:t>
+            </w:r>
+            <w:r>
+              <w:t xml:space="preserve">),</w:t>
+            </w:r>
+            <w:r>
+              <w:t xml:space="preserve"> </w:t>
+            </w:r>
+            <w:r>
+              <w:rPr>
+                <w:rStyle w:val="VerbatimChar"/>
+              </w:rPr>
+              <w:t xml:space="preserve">govsim/endpoints.py</w:t>
+            </w:r>
+            <w:r>
+              <w:t xml:space="preserve"> </w:t>
+            </w:r>
+            <w:r>
+              <w:t xml:space="preserve">(</w:t>
+            </w:r>
+            <w:r>
+              <w:rPr>
+                <w:rStyle w:val="VerbatimChar"/>
+              </w:rPr>
+              <w:t xml:space="preserve">DescriptorChecker</w:t>
+            </w:r>
+            <w:r>
+              <w:t xml:space="preserve">)</w:t>
+            </w:r>
+          </w:p>
+        </w:tc>
+        <w:tc>
+          <w:tcPr/>
+          <w:p>
+            <w:pPr>
+              <w:pStyle w:val="Compact"/>
+              <w:jc w:val="left"/>
+            </w:pPr>
+            <w:r>
+              <w:rPr>
+                <w:rStyle w:val="VerbatimChar"/>
+              </w:rPr>
+              <w:t xml:space="preserve">tests/test_h02_enforcement_points.py</w:t>
+            </w:r>
+          </w:p>
+        </w:tc>
+        <w:tc>
+          <w:tcPr/>
+          <w:p>
+            <w:pPr>
+              <w:pStyle w:val="Compact"/>
+              <w:jc w:val="left"/>
+            </w:pPr>
+            <w:r>
+              <w:t xml:space="preserve">in-GPU checkers, an ask to NVIDIA</w:t>
             </w:r>
           </w:p>
         </w:tc>
@@ -11676,13 +12126,13 @@
         <w:rPr>
           <w:rStyle w:val="VerbatimChar"/>
         </w:rPr>
-        <w:t xml:space="preserve">test_h16_*.py</w:t>
-      </w:r>
-      <w:r>
-        <w:t xml:space="preserve"> </w:t>
-      </w:r>
-      <w:r>
-        <w:t xml:space="preserve">(159</w:t>
+        <w:t xml:space="preserve">test_h18_*.py</w:t>
+      </w:r>
+      <w:r>
+        <w:t xml:space="preserve"> </w:t>
+      </w:r>
+      <w:r>
+        <w:t xml:space="preserve">(200</w:t>
       </w:r>
       <w:r>
         <w:t xml:space="preserve"> </w:t>
@@ -20670,6 +21120,59 @@
           </w:p>
         </w:tc>
       </w:tr>
+      <w:tr>
+        <w:tc>
+          <w:tcPr/>
+          <w:p>
+            <w:pPr>
+              <w:pStyle w:val="Compact"/>
+              <w:jc w:val="left"/>
+            </w:pPr>
+            <w:r>
+              <w:rPr>
+                <w:rStyle w:val="VerbatimChar"/>
+              </w:rPr>
+              <w:t xml:space="preserve">LOOP_REPORT</w:t>
+            </w:r>
+          </w:p>
+        </w:tc>
+        <w:tc>
+          <w:tcPr/>
+          <w:p>
+            <w:pPr>
+              <w:pStyle w:val="Compact"/>
+              <w:jc w:val="left"/>
+            </w:pPr>
+            <w:r>
+              <w:t xml:space="preserve">governor → all, in reply to the beacon the authority's heartbeat carries</w:t>
+            </w:r>
+          </w:p>
+        </w:tc>
+        <w:tc>
+          <w:tcPr/>
+          <w:p>
+            <w:pPr>
+              <w:pStyle w:val="Compact"/>
+              <w:jc w:val="left"/>
+            </w:pPr>
+            <w:r>
+              <w:t xml:space="preserve">Loop id, beacon sequence, own switch state, current sensed, signature</w:t>
+            </w:r>
+          </w:p>
+        </w:tc>
+        <w:tc>
+          <w:tcPr/>
+          <w:p>
+            <w:pPr>
+              <w:pStyle w:val="Compact"/>
+              <w:jc w:val="left"/>
+            </w:pPr>
+            <w:r>
+              <w:t xml:space="preserve">The loop roll call: a member reporting its switch open while current flows is jumpered</w:t>
+            </w:r>
+          </w:p>
+        </w:tc>
+      </w:tr>
     </w:tbl>
     <w:bookmarkEnd w:id="117"/>
     <w:bookmarkStart w:id="118" w:name="roster-formation"/>
@@ -31776,19 +32279,28 @@
               <w:jc w:val="left"/>
             </w:pPr>
             <w:r>
-              <w:t xml:space="preserve">Loop current is sensed at every governor, so the jumpered governor itself still stops when its heartbeat expires or it is commanded; its absence from the loop is not detected today. A low-rate member-count beacon on the message fabric that would make the absence an alarm is specified here and not yet in the model</w:t>
-            </w:r>
-          </w:p>
-        </w:tc>
-        <w:tc>
-          <w:tcPr/>
-          <w:p>
-            <w:pPr>
-              <w:pStyle w:val="Compact"/>
-              <w:jc w:val="left"/>
-            </w:pPr>
-            <w:r>
-              <w:t xml:space="preserve">An attacker who can jumper the wire has board-level access, which the enclosure tamper switch should have reported; until the beacon exists, a jumpered governor cannot stop the rack through the loop</w:t>
+              <w:t xml:space="preserve">Loop current is sensed at every governor, and the authority's heartbeat carries a beacon naming the loop's expected members; every governor replies with a signed report of its switch state and the current it senses; a member that reports its switch open while the loop carries current has been jumpered: alarm LOOP_JUMPERED names it and the rack halts (</w:t>
+            </w:r>
+            <w:r>
+              <w:rPr>
+                <w:rStyle w:val="VerbatimChar"/>
+              </w:rPr>
+              <w:t xml:space="preserve">tests/test_h11_halt_loop.py</w:t>
+            </w:r>
+            <w:r>
+              <w:t xml:space="preserve">)</w:t>
+            </w:r>
+          </w:p>
+        </w:tc>
+        <w:tc>
+          <w:tcPr/>
+          <w:p>
+            <w:pPr>
+              <w:pStyle w:val="Compact"/>
+              <w:jc w:val="left"/>
+            </w:pPr>
+            <w:r>
+              <w:t xml:space="preserve">A jumpered governor whose switch is closed is indistinguishable from a healthy one and gains the attacker nothing until it tries to open; an attacker who can jumper the wire has board-level access, which the enclosure tamper switch should have reported</w:t>
             </w:r>
           </w:p>
         </w:tc>
@@ -35167,6 +35679,136 @@
           </w:p>
         </w:tc>
       </w:tr>
+      <w:tr>
+        <w:tc>
+          <w:tcPr/>
+          <w:p>
+            <w:pPr>
+              <w:pStyle w:val="Compact"/>
+              <w:jc w:val="left"/>
+            </w:pPr>
+            <w:r>
+              <w:t xml:space="preserve">H17</w:t>
+            </w:r>
+          </w:p>
+        </w:tc>
+        <w:tc>
+          <w:tcPr/>
+          <w:p>
+            <w:pPr>
+              <w:pStyle w:val="Compact"/>
+              <w:jc w:val="left"/>
+            </w:pPr>
+            <w:r>
+              <w:t xml:space="preserve">No governed action initiates without a ticket, and no governed response leaves the rack without a release ticket</w:t>
+            </w:r>
+          </w:p>
+        </w:tc>
+        <w:tc>
+          <w:tcPr/>
+          <w:p>
+            <w:pPr>
+              <w:pStyle w:val="Compact"/>
+              <w:jc w:val="left"/>
+            </w:pPr>
+            <w:r>
+              <w:t xml:space="preserve">A strike, payment, message or shipment executes with no ticket, or a response reaches the user with no release ticket, or a forged, replayed, wrong-session or wrong-hash ticket is honoured</w:t>
+            </w:r>
+          </w:p>
+        </w:tc>
+        <w:tc>
+          <w:tcPr/>
+          <w:p>
+            <w:pPr>
+              <w:pStyle w:val="Compact"/>
+              <w:jc w:val="left"/>
+            </w:pPr>
+            <w:r>
+              <w:t xml:space="preserve">sim</w:t>
+            </w:r>
+          </w:p>
+        </w:tc>
+        <w:tc>
+          <w:tcPr/>
+          <w:p>
+            <w:pPr>
+              <w:pStyle w:val="Compact"/>
+              <w:jc w:val="left"/>
+            </w:pPr>
+            <w:r>
+              <w:rPr>
+                <w:rStyle w:val="VerbatimChar"/>
+              </w:rPr>
+              <w:t xml:space="preserve">tests/test_h17_use_cases.py</w:t>
+            </w:r>
+          </w:p>
+        </w:tc>
+      </w:tr>
+      <w:tr>
+        <w:tc>
+          <w:tcPr/>
+          <w:p>
+            <w:pPr>
+              <w:pStyle w:val="Compact"/>
+              <w:jc w:val="left"/>
+            </w:pPr>
+            <w:r>
+              <w:t xml:space="preserve">H18</w:t>
+            </w:r>
+          </w:p>
+        </w:tc>
+        <w:tc>
+          <w:tcPr/>
+          <w:p>
+            <w:pPr>
+              <w:pStyle w:val="Compact"/>
+              <w:jc w:val="left"/>
+            </w:pPr>
+            <w:r>
+              <w:t xml:space="preserve">Oversight survives the model: the observer is always invoked and cannot be impersonated, audit sampling is unpredictable, the evaluated model is the deployed model, compute and hazard budgets bind</w:t>
+            </w:r>
+          </w:p>
+        </w:tc>
+        <w:tc>
+          <w:tcPr/>
+          <w:p>
+            <w:pPr>
+              <w:pStyle w:val="Compact"/>
+              <w:jc w:val="left"/>
+            </w:pPr>
+            <w:r>
+              <w:t xml:space="preserve">A release passes with no observer verdict or with a verdict under the host's or the governor's own key; a sampled or hazard-class response leaves before the audit store's receipt; a model digest with no evaluation attestation gets its key; a budget is exceeded without a throttle or a license</w:t>
+            </w:r>
+          </w:p>
+        </w:tc>
+        <w:tc>
+          <w:tcPr/>
+          <w:p>
+            <w:pPr>
+              <w:pStyle w:val="Compact"/>
+              <w:jc w:val="left"/>
+            </w:pPr>
+            <w:r>
+              <w:t xml:space="preserve">sim</w:t>
+            </w:r>
+          </w:p>
+        </w:tc>
+        <w:tc>
+          <w:tcPr/>
+          <w:p>
+            <w:pPr>
+              <w:pStyle w:val="Compact"/>
+              <w:jc w:val="left"/>
+            </w:pPr>
+            <w:r>
+              <w:rPr>
+                <w:rStyle w:val="VerbatimChar"/>
+              </w:rPr>
+              <w:t xml:space="preserve">tests/test_h18_oversight.py</w:t>
+            </w:r>
+          </w:p>
+        </w:tc>
+      </w:tr>
     </w:tbl>
     <w:bookmarkEnd w:id="163"/>
     <w:bookmarkStart w:id="164" w:name="X7f1464b399974878784de4e13dda2a5507f7df8"/>
@@ -36985,13 +37627,13 @@
               <w:jc w:val="left"/>
             </w:pPr>
             <w:r>
-              <w:t xml:space="preserve">Not detected by the model today; a member-count beacon on the message fabric is planned (</w:t>
+              <w:t xml:space="preserve">The loop beacon: a member whose own signed report says its switch is open while the loop carries current is named and the rack halts (</w:t>
             </w:r>
             <w:r>
               <w:rPr>
                 <w:rStyle w:val="VerbatimChar"/>
               </w:rPr>
-              <w:t xml:space="preserve">05-threat-model.md</w:t>
+              <w:t xml:space="preserve">02-safety-fabric.md</w:t>
             </w:r>
             <w:r>
               <w:t xml:space="preserve">)</w:t>
@@ -37006,7 +37648,7 @@
               <w:jc w:val="left"/>
             </w:pPr>
             <w:r>
-              <w:t xml:space="preserve">The other governors' switches still open the loop; this governor's slot stops only when its own heartbeat expires</w:t>
+              <w:t xml:space="preserve">The other governors' switches still open the loop; the beacon names the odd one out</w:t>
             </w:r>
           </w:p>
         </w:tc>
@@ -49987,7 +50629,7 @@
         <w:pStyle w:val="FirstParagraph"/>
       </w:pPr>
       <w:r>
-        <w:t xml:space="preserve">Generated 2026-10-13 20:23 UTC by</w:t>
+        <w:t xml:space="preserve">Generated 2026-10-13 22:50 UTC by</w:t>
       </w:r>
       <w:r>
         <w:t xml:space="preserve"> </w:t>
@@ -50326,7 +50968,7 @@
               <w:jc w:val="left"/>
             </w:pPr>
             <w:r>
-              <w:t xml:space="preserve">descriptor-level: a transfer between two roster members a rule would not allow</w:t>
+              <w:t xml:space="preserve">descriptor-level: a transfer between two roster members the buffer policy would not allow</w:t>
             </w:r>
           </w:p>
         </w:tc>
@@ -50362,7 +51004,7 @@
               <w:jc w:val="left"/>
             </w:pPr>
             <w:r>
-              <w:t xml:space="preserve">gap</w:t>
+              <w:t xml:space="preserve">pass</w:t>
             </w:r>
           </w:p>
         </w:tc>
@@ -50884,7 +51526,7 @@
               <w:jc w:val="left"/>
             </w:pPr>
             <w:r>
-              <w:t xml:space="preserve">a halt reaches every GPU within the bound; nobody clears alone</w:t>
+              <w:t xml:space="preserve">a halt reaches every GPU within the bound; nobody clears alone; a governor jumpered out of the loop is named and the loop opened</w:t>
             </w:r>
           </w:p>
         </w:tc>
@@ -51195,6 +51837,130 @@
             </w:pPr>
             <w:r>
               <w:t xml:space="preserve">the levers work without the GPU's cooperation</w:t>
+            </w:r>
+          </w:p>
+        </w:tc>
+        <w:tc>
+          <w:tcPr/>
+          <w:p>
+            <w:pPr>
+              <w:pStyle w:val="Compact"/>
+              <w:jc w:val="left"/>
+            </w:pPr>
+            <w:r>
+              <w:t xml:space="preserve">pass</w:t>
+            </w:r>
+          </w:p>
+        </w:tc>
+        <w:tc>
+          <w:tcPr/>
+          <w:p>
+            <w:pPr>
+              <w:pStyle w:val="Compact"/>
+              <w:jc w:val="left"/>
+            </w:pPr>
+            <w:r>
+              <w:t xml:space="preserve">pass</w:t>
+            </w:r>
+          </w:p>
+        </w:tc>
+        <w:tc>
+          <w:tcPr/>
+          <w:p>
+            <w:pPr>
+              <w:pStyle w:val="Compact"/>
+              <w:jc w:val="left"/>
+            </w:pPr>
+            <w:r>
+              <w:t xml:space="preserve">pass</w:t>
+            </w:r>
+          </w:p>
+        </w:tc>
+      </w:tr>
+      <w:tr>
+        <w:tc>
+          <w:tcPr/>
+          <w:p>
+            <w:pPr>
+              <w:pStyle w:val="Compact"/>
+              <w:jc w:val="left"/>
+            </w:pPr>
+            <w:r>
+              <w:t xml:space="preserve">H17</w:t>
+            </w:r>
+          </w:p>
+        </w:tc>
+        <w:tc>
+          <w:tcPr/>
+          <w:p>
+            <w:pPr>
+              <w:pStyle w:val="Compact"/>
+              <w:jc w:val="left"/>
+            </w:pPr>
+            <w:r>
+              <w:t xml:space="preserve">no governed action initiates without a ticket and no governed response leaves the rack without a release ticket</w:t>
+            </w:r>
+          </w:p>
+        </w:tc>
+        <w:tc>
+          <w:tcPr/>
+          <w:p>
+            <w:pPr>
+              <w:pStyle w:val="Compact"/>
+              <w:jc w:val="left"/>
+            </w:pPr>
+            <w:r>
+              <w:t xml:space="preserve">pass</w:t>
+            </w:r>
+          </w:p>
+        </w:tc>
+        <w:tc>
+          <w:tcPr/>
+          <w:p>
+            <w:pPr>
+              <w:pStyle w:val="Compact"/>
+              <w:jc w:val="left"/>
+            </w:pPr>
+            <w:r>
+              <w:t xml:space="preserve">pass</w:t>
+            </w:r>
+          </w:p>
+        </w:tc>
+        <w:tc>
+          <w:tcPr/>
+          <w:p>
+            <w:pPr>
+              <w:pStyle w:val="Compact"/>
+              <w:jc w:val="left"/>
+            </w:pPr>
+            <w:r>
+              <w:t xml:space="preserve">pass</w:t>
+            </w:r>
+          </w:p>
+        </w:tc>
+      </w:tr>
+      <w:tr>
+        <w:tc>
+          <w:tcPr/>
+          <w:p>
+            <w:pPr>
+              <w:pStyle w:val="Compact"/>
+              <w:jc w:val="left"/>
+            </w:pPr>
+            <w:r>
+              <w:t xml:space="preserve">H18</w:t>
+            </w:r>
+          </w:p>
+        </w:tc>
+        <w:tc>
+          <w:tcPr/>
+          <w:p>
+            <w:pPr>
+              <w:pStyle w:val="Compact"/>
+              <w:jc w:val="left"/>
+            </w:pPr>
+            <w:r>
+              <w:t xml:space="preserve">oversight survives the model: the observer is always invoked and cannot be impersonated, audit sampling is unpredictable, the evaluated model is the deployed model, compute and hazard budgets bind</w:t>
             </w:r>
           </w:p>
         </w:tc>
@@ -51419,7 +52185,7 @@
               <w:jc w:val="left"/>
             </w:pPr>
             <w:r>
-              <w:t xml:space="preserve">5.1 ms</w:t>
+              <w:t xml:space="preserve">5.2 ms</w:t>
             </w:r>
           </w:p>
         </w:tc>
@@ -51517,7 +52283,7 @@
               <w:jc w:val="left"/>
             </w:pPr>
             <w:r>
-              <w:t xml:space="preserve">5.1 ms</w:t>
+              <w:t xml:space="preserve">5.2 ms</w:t>
             </w:r>
           </w:p>
         </w:tc>
@@ -51615,7 +52381,7 @@
               <w:jc w:val="left"/>
             </w:pPr>
             <w:r>
-              <w:t xml:space="preserve">5.1 ms</w:t>
+              <w:t xml:space="preserve">5.2 ms</w:t>
             </w:r>
           </w:p>
         </w:tc>
@@ -51639,7 +52405,7 @@
               <w:jc w:val="left"/>
             </w:pPr>
             <w:r>
-              <w:t xml:space="preserve">0.051 %</w:t>
+              <w:t xml:space="preserve">0.052 %</w:t>
             </w:r>
           </w:p>
         </w:tc>
@@ -51707,7 +52473,7 @@
         <w:t xml:space="preserve">H2b at rack and board</w:t>
       </w:r>
       <w:r>
-        <w:t xml:space="preserve">: from the board the governor governs links and flows, not descriptors. Two legitimate roster members can exchange bytes a rule would not have allowed. That is the residual named in</w:t>
+        <w:t xml:space="preserve">: from the board the governor governs links and flows, not descriptors. Two legitimate roster members can exchange bytes the buffer policy would not have allowed (the weights, over the copy engine). That is the residual named in</w:t>
       </w:r>
       <w:r>
         <w:t xml:space="preserve"> </w:t>
@@ -51722,26 +52488,7 @@
         <w:t xml:space="preserve"> </w:t>
       </w:r>
       <w:r>
-        <w:t xml:space="preserve">N5.</w:t>
-      </w:r>
-    </w:p>
-    <w:p>
-      <w:pPr>
-        <w:numPr>
-          <w:ilvl w:val="0"/>
-          <w:numId w:val="1036"/>
-        </w:numPr>
-        <w:pStyle w:val="Compact"/>
-      </w:pPr>
-      <w:r>
-        <w:rPr>
-          <w:bCs/>
-          <w:b/>
-        </w:rPr>
-        <w:t xml:space="preserve">H2b at integrated</w:t>
-      </w:r>
-      <w:r>
-        <w:t xml:space="preserve">: descriptor checker modelled; a buffer-class policy is not. The copy-engine checker refuses a stranger, but the governor programs it with the same roster capabilities as the switches, so a transfer between two roster members still passes.</w:t>
+        <w:t xml:space="preserve">N5. At the integrated tier the descriptor checkers are keyed per buffer class and programmed from the policy image's buffer policy, which closes it there.</w:t>
       </w:r>
     </w:p>
     <w:p>

</xml_diff>